<commit_message>
v11_ko: state applicant information as scope, not inability (6.2, 6.3)
Co-Authored-By: Claude Fable 5.1 <noreply@anthropic.com>
Claude-Session: https://claude.ai/code/session_01SvckvZxt3hAXTDPnm8YPEC
</commit_message>
<xml_diff>
--- a/journal/manuscript_v11_ko.docx
+++ b/journal/manuscript_v11_ko.docx
@@ -8993,7 +8993,7 @@
         <w:pStyle w:val="FirstParagraph"/>
       </w:pPr>
       <w:r>
-        <w:t xml:space="preserve">후공정 기업에게 결과는 분명한 경고다. 전통적 조립·테스트 사업은 제조와의 안정된 인터페이스에 기대어 왔으나, 하이브리드 본딩에서 그 인터페이스는 무너졌고 기술을 정의하는 특허는 전공정에 닿는다. 자료에 출원인 정보가 없으므로 누가 어떤 청구를 차지했는지는 말할 수 없지만, 독립적 산업 분석이 파운드리, 종합반도체기업, 라이선싱 기업을 주요 출원인으로 꼽는 점(Yole Group, 2024)을 함께 보면, 평탄화와 표면 화학 역량이 없는 조립 전문기업은 통합형 청구를 둘러싼 경쟁에서 불리할 가능성이 크다. 경계 넘기가 범위와 관련된다는 결과는 필요한 역량이 하나의 공정 단계가 아니라 웨이퍼 준비에서 접합된 적층까지의 흐름 전체를 청구할 수 있는 능력임을 시사한다.</w:t>
+        <w:t xml:space="preserve">후공정 기업에게 결과는 분명한 경고다. 전통적 조립·테스트 사업은 제조와의 안정된 인터페이스에 기대어 왔으나, 하이브리드 본딩에서 그 인터페이스는 무너졌고 기술을 정의하는 특허는 전공정에 닿는다. 독립적 산업 분석이 파운드리, 종합반도체기업, 라이선싱 기업을 주요 출원인으로 꼽는 점(Yole Group, 2024)을 보면, 평탄화와 표면 화학 역량이 없는 조립 전문기업은 통합형 청구를 둘러싼 경쟁에서 불리할 가능성이 크다. 경계 넘기가 범위와 관련된다는 결과는 필요한 역량이 하나의 공정 단계가 아니라 웨이퍼 준비에서 접합된 적층까지의 흐름 전체를 청구할 수 있는 능력임을 시사한다.</w:t>
       </w:r>
     </w:p>
     <w:p>
@@ -9027,7 +9027,7 @@
         <w:pStyle w:val="FirstParagraph"/>
       </w:pPr>
       <w:r>
-        <w:t xml:space="preserve">본 연구의 한계는 세 가지다. 첫째, 자료에 출원인 정보가 없다. 따라서 중국 출원청의 프로필이 중국 기업의 추격 출원에서 온 것인지, 외국 기업이 중국에 낸 방어적 출원이나 중국 특허청의 분류 관행에서 온 것인지 가려낼 수 없다. 제6.1절의 추격 해석은 이 가능성들과 양립하는 하나의 해석이다. 출원인 정보를 결합하면 기업 고정효과 등으로 더 정밀한 추정이 가능하다. 둘째, 추정치는 상관관계다. 범위와 전략은 함께 결정될 가능성이 높고 적절한 도구변수가 없으므로 인과관계는 주장하지 않는다. 기술범위도 H01L21·H01L24 두 클래스 안에서만 잰 것이어서, 반도체 밖으로 뻗는 본래 의미의 범위(Lerner, 1994)를 보려면 전체 CPC 기호가 필요하다. 셋째, 융합의 신호로 쓴 CPC 공동분류는 재현 가능하지만 발명보다 늦게 부여된다. 텍스트 기반 방법(Preschitschek et al., 2013; Zhu and Motohashi, 2022)은 더 이른 탐지가 가능하지만 학습된 모형에 의존한다. H01L21과 H01L24의 경계가 제도적으로 뚜렷한 본 연구에서는 재현가능성을 택했다.</w:t>
+        <w:t xml:space="preserve">본 연구의 한계는 세 가지다. 첫째, 본 연구는 출원청 단위로 분석하였고 출원인 정보는 결합하지 않았다. 따라서 중국 출원청의 프로필이 어떤 출원인 집단에서 비롯되는지는 가리지 않으며, PATSTAT의 출원인 국적과 유형을 결합해 기업 수준에서 확인하는 것이 다음 단계다. 둘째, 추정치는 상관관계다. 범위와 전략은 함께 결정될 가능성이 높고 적절한 도구변수가 없으므로 인과관계는 주장하지 않는다. 기술범위도 H01L21·H01L24 두 클래스 안에서만 잰 것이어서, 반도체 밖으로 뻗는 본래 의미의 범위(Lerner, 1994)를 보려면 전체 CPC 기호가 필요하다. 셋째, 융합의 신호로 쓴 CPC 공동분류는 재현 가능하지만 발명보다 늦게 부여된다. 텍스트 기반 방법(Preschitschek et al., 2013; Zhu and Motohashi, 2022)은 더 이른 탐지가 가능하지만 학습된 모형에 의존한다. H01L21과 H01L24의 경계가 제도적으로 뚜렷한 본 연구에서는 재현가능성을 택했다.</w:t>
       </w:r>
     </w:p>
     <w:p>

</xml_diff>

<commit_message>
Add v12_ko (applicant wording change); restore v11_ko; version-parametrized build scripts
Co-Authored-By: Claude Fable 5.1 <noreply@anthropic.com>
Claude-Session: https://claude.ai/code/session_01SvckvZxt3hAXTDPnm8YPEC
</commit_message>
<xml_diff>
--- a/journal/manuscript_v11_ko.docx
+++ b/journal/manuscript_v11_ko.docx
@@ -8993,7 +8993,7 @@
         <w:pStyle w:val="FirstParagraph"/>
       </w:pPr>
       <w:r>
-        <w:t xml:space="preserve">후공정 기업에게 결과는 분명한 경고다. 전통적 조립·테스트 사업은 제조와의 안정된 인터페이스에 기대어 왔으나, 하이브리드 본딩에서 그 인터페이스는 무너졌고 기술을 정의하는 특허는 전공정에 닿는다. 독립적 산업 분석이 파운드리, 종합반도체기업, 라이선싱 기업을 주요 출원인으로 꼽는 점(Yole Group, 2024)을 보면, 평탄화와 표면 화학 역량이 없는 조립 전문기업은 통합형 청구를 둘러싼 경쟁에서 불리할 가능성이 크다. 경계 넘기가 범위와 관련된다는 결과는 필요한 역량이 하나의 공정 단계가 아니라 웨이퍼 준비에서 접합된 적층까지의 흐름 전체를 청구할 수 있는 능력임을 시사한다.</w:t>
+        <w:t xml:space="preserve">후공정 기업에게 결과는 분명한 경고다. 전통적 조립·테스트 사업은 제조와의 안정된 인터페이스에 기대어 왔으나, 하이브리드 본딩에서 그 인터페이스는 무너졌고 기술을 정의하는 특허는 전공정에 닿는다. 자료에 출원인 정보가 없으므로 누가 어떤 청구를 차지했는지는 말할 수 없지만, 독립적 산업 분석이 파운드리, 종합반도체기업, 라이선싱 기업을 주요 출원인으로 꼽는 점(Yole Group, 2024)을 함께 보면, 평탄화와 표면 화학 역량이 없는 조립 전문기업은 통합형 청구를 둘러싼 경쟁에서 불리할 가능성이 크다. 경계 넘기가 범위와 관련된다는 결과는 필요한 역량이 하나의 공정 단계가 아니라 웨이퍼 준비에서 접합된 적층까지의 흐름 전체를 청구할 수 있는 능력임을 시사한다.</w:t>
       </w:r>
     </w:p>
     <w:p>
@@ -9027,7 +9027,7 @@
         <w:pStyle w:val="FirstParagraph"/>
       </w:pPr>
       <w:r>
-        <w:t xml:space="preserve">본 연구의 한계는 세 가지다. 첫째, 본 연구는 출원청 단위로 분석하였고 출원인 정보는 결합하지 않았다. 따라서 중국 출원청의 프로필이 어떤 출원인 집단에서 비롯되는지는 가리지 않으며, PATSTAT의 출원인 국적과 유형을 결합해 기업 수준에서 확인하는 것이 다음 단계다. 둘째, 추정치는 상관관계다. 범위와 전략은 함께 결정될 가능성이 높고 적절한 도구변수가 없으므로 인과관계는 주장하지 않는다. 기술범위도 H01L21·H01L24 두 클래스 안에서만 잰 것이어서, 반도체 밖으로 뻗는 본래 의미의 범위(Lerner, 1994)를 보려면 전체 CPC 기호가 필요하다. 셋째, 융합의 신호로 쓴 CPC 공동분류는 재현 가능하지만 발명보다 늦게 부여된다. 텍스트 기반 방법(Preschitschek et al., 2013; Zhu and Motohashi, 2022)은 더 이른 탐지가 가능하지만 학습된 모형에 의존한다. H01L21과 H01L24의 경계가 제도적으로 뚜렷한 본 연구에서는 재현가능성을 택했다.</w:t>
+        <w:t xml:space="preserve">본 연구의 한계는 세 가지다. 첫째, 자료에 출원인 정보가 없다. 따라서 중국 출원청의 프로필이 중국 기업의 추격 출원에서 온 것인지, 외국 기업이 중국에 낸 방어적 출원이나 중국 특허청의 분류 관행에서 온 것인지 가려낼 수 없다. 제6.1절의 추격 해석은 이 가능성들과 양립하는 하나의 해석이다. 출원인 정보를 결합하면 기업 고정효과 등으로 더 정밀한 추정이 가능하다. 둘째, 추정치는 상관관계다. 범위와 전략은 함께 결정될 가능성이 높고 적절한 도구변수가 없으므로 인과관계는 주장하지 않는다. 기술범위도 H01L21·H01L24 두 클래스 안에서만 잰 것이어서, 반도체 밖으로 뻗는 본래 의미의 범위(Lerner, 1994)를 보려면 전체 CPC 기호가 필요하다. 셋째, 융합의 신호로 쓴 CPC 공동분류는 재현 가능하지만 발명보다 늦게 부여된다. 텍스트 기반 방법(Preschitschek et al., 2013; Zhu and Motohashi, 2022)은 더 이른 탐지가 가능하지만 학습된 모형에 의존한다. H01L21과 H01L24의 경계가 제도적으로 뚜렷한 본 연구에서는 재현가능성을 택했다.</w:t>
       </w:r>
     </w:p>
     <w:p>

</xml_diff>